<commit_message>
Excecutive summary feature implemented and tested things are working great
</commit_message>
<xml_diff>
--- a/Automation/backend/CSS-NEW_Technical_Sample_Report_Automated_v2.1.docx
+++ b/Automation/backend/CSS-NEW_Technical_Sample_Report_Automated_v2.1.docx
@@ -6393,6 +6393,110 @@
       <w:bookmarkEnd w:id="8"/>
       <w:bookmarkEnd w:id="9"/>
       <w:bookmarkEnd w:id="10"/>
+    </w:p>
+    <w:p>
+      <w:r>
+        <w:t>_RISK_ASSESSMENT_ANALYSIS_PLACEHOLDER_</w:t>
+      </w:r>
+    </w:p>
+    <w:p>
+      <w:pPr>
+        <w:keepNext/>
+        <w:keepLines/>
+        <w:spacing w:before="240" w:after="0"/>
+        <w:ind w:firstLine="720"/>
+        <w:outlineLvl w:val="0"/>
+        <w:rPr>
+          <w:rFonts w:ascii="Altone Trial" w:eastAsiaTheme="majorEastAsia" w:hAnsi="Altone Trial" w:cs="Altone Trial"/>
+          <w:color w:val="7030A0"/>
+          <w:sz w:val="32"/>
+          <w:szCs w:val="32"/>
+        </w:rPr>
+      </w:pPr>
+      <w:bookmarkStart w:id="6" w:name="_Toc140592081"/>
+      <w:bookmarkStart w:id="7" w:name="_Toc140573515"/>
+      <w:bookmarkStart w:id="8" w:name="_Toc138358532"/>
+      <w:bookmarkStart w:id="9" w:name="_Hlk144990213"/>
+      <w:bookmarkStart w:id="10" w:name="_Toc145157700"/>
+      <w:bookmarkEnd w:id="6"/>
+      <w:bookmarkEnd w:id="7"/>
+      <w:bookmarkEnd w:id="8"/>
+      <w:bookmarkEnd w:id="9"/>
+      <w:bookmarkEnd w:id="10"/>
+      <w:r>
+        <w:t>Test Case</w:t>
+      </w:r>
+    </w:p>
+    <w:p>
+      <w:r>
+        <w:t>_TEST_CASE_TABLE_PLACEHOLDER_</w:t>
+      </w:r>
+    </w:p>
+    <w:p>
+      <w:pPr>
+        <w:keepNext/>
+        <w:keepLines/>
+        <w:spacing w:before="240" w:after="0"/>
+        <w:ind w:firstLine="720"/>
+        <w:outlineLvl w:val="0"/>
+        <w:rPr>
+          <w:rFonts w:ascii="Altone Trial" w:eastAsiaTheme="majorEastAsia" w:hAnsi="Altone Trial" w:cs="Altone Trial"/>
+          <w:color w:val="7030A0"/>
+          <w:sz w:val="32"/>
+          <w:szCs w:val="32"/>
+        </w:rPr>
+      </w:pPr>
+      <w:bookmarkStart w:id="6" w:name="_Toc140592081"/>
+      <w:bookmarkStart w:id="7" w:name="_Toc140573515"/>
+      <w:bookmarkStart w:id="8" w:name="_Toc138358532"/>
+      <w:bookmarkStart w:id="9" w:name="_Hlk144990213"/>
+      <w:bookmarkStart w:id="10" w:name="_Toc145157700"/>
+      <w:bookmarkEnd w:id="6"/>
+      <w:bookmarkEnd w:id="7"/>
+      <w:bookmarkEnd w:id="8"/>
+      <w:bookmarkEnd w:id="9"/>
+      <w:bookmarkEnd w:id="10"/>
+      <w:r>
+        <w:t>Vulnerabilities Found</w:t>
+      </w:r>
+    </w:p>
+    <w:p>
+      <w:r>
+        <w:t>_VULNERABILITIES_FOUND_PLACEHOLDER_</w:t>
+      </w:r>
+    </w:p>
+    <w:p>
+      <w:pPr>
+        <w:keepNext/>
+        <w:keepLines/>
+        <w:spacing w:before="240" w:after="0"/>
+        <w:ind w:firstLine="720"/>
+        <w:outlineLvl w:val="0"/>
+        <w:rPr>
+          <w:rFonts w:ascii="Altone Trial" w:eastAsiaTheme="majorEastAsia" w:hAnsi="Altone Trial" w:cs="Altone Trial"/>
+          <w:color w:val="7030A0"/>
+          <w:sz w:val="32"/>
+          <w:szCs w:val="32"/>
+        </w:rPr>
+      </w:pPr>
+      <w:bookmarkStart w:id="6" w:name="_Toc140592081"/>
+      <w:bookmarkStart w:id="7" w:name="_Toc140573515"/>
+      <w:bookmarkStart w:id="8" w:name="_Toc138358532"/>
+      <w:bookmarkStart w:id="9" w:name="_Hlk144990213"/>
+      <w:bookmarkStart w:id="10" w:name="_Toc145157700"/>
+      <w:bookmarkEnd w:id="6"/>
+      <w:bookmarkEnd w:id="7"/>
+      <w:bookmarkEnd w:id="8"/>
+      <w:bookmarkEnd w:id="9"/>
+      <w:bookmarkEnd w:id="10"/>
+      <w:r>
+        <w:t>URL</w:t>
+      </w:r>
+    </w:p>
+    <w:p>
+      <w:r>
+        <w:t>_VULNERABILITY_SUMMARY_TABLE_PLACEHOLDER_</w:t>
+      </w:r>
     </w:p>
     <w:p>
       <w:pPr>

</xml_diff>